<commit_message>
Remove member names from the report
</commit_message>
<xml_diff>
--- a/docs/Ethical_RPA_Screenshots.docx
+++ b/docs/Ethical_RPA_Screenshots.docx
@@ -20,46 +20,6 @@
           <w:szCs w:val="36"/>
         </w:rPr>
         <w:t>Ethical RPA for Financial Auditing</w:t>
-      </w:r>
-    </w:p>
-    <w:p>
-      <w:pPr>
-        <w:spacing w:line="240" w:lineRule="auto"/>
-        <w:rPr>
-          <w:b/>
-          <w:color w:val="1F2A44"/>
-          <w:sz w:val="28"/>
-          <w:szCs w:val="28"/>
-        </w:rPr>
-      </w:pPr>
-      <w:r>
-        <w:rPr>
-          <w:b/>
-          <w:color w:val="1F2A44"/>
-          <w:sz w:val="28"/>
-          <w:szCs w:val="28"/>
-        </w:rPr>
-        <w:t xml:space="preserve">Vishnu S L – 23BRS1122                                                          </w:t>
-      </w:r>
-    </w:p>
-    <w:p>
-      <w:pPr>
-        <w:spacing w:line="240" w:lineRule="auto"/>
-        <w:rPr>
-          <w:b/>
-          <w:color w:val="1F2A44"/>
-          <w:sz w:val="28"/>
-          <w:szCs w:val="28"/>
-        </w:rPr>
-      </w:pPr>
-      <w:r>
-        <w:rPr>
-          <w:b/>
-          <w:color w:val="1F2A44"/>
-          <w:sz w:val="28"/>
-          <w:szCs w:val="28"/>
-        </w:rPr>
-        <w:t>Dinesh A – 23BRS1017</w:t>
       </w:r>
     </w:p>
     <w:p>

</xml_diff>